<commit_message>
Set every figure caption on one line
Figure 1's caption ran three lines inside a 3in float and Figures 2 and
4 ran two. All six are now single-line in both the PDF and the .docx.

Nothing left the page. Figure 1's node labels already name the cycle it
described; Figure 2's six labelled nodes already name the steps it
listed; and Figure 4's county register carries ILLUSTRATIVE ONLY in the
artwork, so dropping that clause from the caption keeps the caveat
visible. Figure 4's shading key stays in the caption because the artwork
does not state it.

Widths were measured through the same SVG text path the captions render
in, against the float and column widths they actually occupy, rather
than estimated.

Table captions 1, 6 and 8 still wrap; each carries a qualification with
nowhere else to live. Still 12 pages.

Co-Authored-By: Claude Opus 5 <noreply@anthropic.com>
Claude-Session: https://claude.ai/code/session_01HAZLkLE85rjRAgcZW1sudJ
</commit_message>
<xml_diff>
--- a/docs/crp/passes/Olera_CRP_CommercializationPlan_rebased.docx
+++ b/docs/crp/passes/Olera_CRP_CommercializationPlan_rebased.docx
@@ -108,7 +108,7 @@
                 <w:i w:val="0"/>
                 <w:sz w:val="18"/>
               </w:rPr>
-              <w:t xml:space="preserve"> Unmet eldercare needs can drive a vicious cycle of hospitalization, failed care establishment, and premature institutionalization.</w:t>
+              <w:t xml:space="preserve"> The vicious cycle of unmet need.</w:t>
             </w:r>
           </w:p>
         </w:tc>
@@ -249,7 +249,7 @@
           <w:i w:val="0"/>
           <w:sz w:val="18"/>
         </w:rPr>
-        <w:t xml:space="preserve"> Care establishment requires a coordinated pathway from assessing need through identifying, funding, staffing, executing, and confirming care.</w:t>
+        <w:t xml:space="preserve"> Care establishment requires a coordinated pathway from assessing need through confirming care.</w:t>
       </w:r>
     </w:p>
     <w:p>
@@ -650,7 +650,7 @@
           <w:i w:val="0"/>
           <w:sz w:val="18"/>
         </w:rPr>
-        <w:t xml:space="preserve"> What a family sees, what the system does, and what accumulates across a county. Shaded elements exist today; the county register is illustrative only.</w:t>
+        <w:t xml:space="preserve"> What a family sees, what the system does, and what accumulates across a county. Shaded elements exist today.</w:t>
       </w:r>
     </w:p>
     <w:p>

</xml_diff>

<commit_message>
Verify CP citations and add a bibliography
Renumber every reference marker from the section-local sequences the
source sections carried into one document-wide 1 to 14 sequence, and add
a References section on its own final page at full body size.

Correct three claims the sources did not support as written: the BLS
employment and projection years, the count of peer-reviewed studies, and
the scope of the CMS GUIDE model's stated goals. Table 7 still carried
the revenue-stream section's local marker numbers; renumber them.

Pages 1 to 12 are unchanged in content. AHRQ Technical Brief No. 49's
percentage pairs remain unverified and are logged as the one open
citation.

Co-Authored-By: Claude Opus 5 <noreply@anthropic.com>
Claude-Session: https://claude.ai/code/session_01HAZLkLE85rjRAgcZW1sudJ
</commit_message>
<xml_diff>
--- a/docs/crp/passes/Olera_CRP_CommercializationPlan_rebased.docx
+++ b/docs/crp/passes/Olera_CRP_CommercializationPlan_rebased.docx
@@ -131,7 +131,23 @@
           <w:b w:val="0"/>
           <w:i w:val="0"/>
         </w:rPr>
-        <w:t xml:space="preserve"> Older Americans and their families face a problem the market has not solved. Unmet daily care needs compound into preventable geriatric hospitalization, premature institutionalization, and rising public costs, and each makes the next more likely (Figure 1). Olera developed CareNavigator through NIA Phase I–IIB as a care-navigation platform that helps families identify the care they need, the aid that can help pay for it, and the providers who can deliver it. Its impact potential comes from intervening while unmet need may still be reversible: among community-dwelling Medicaid HCBS users, unmet service needs have been associated with substantially greater emergency-department use (52% vs. 34%) and hospital or rehabilitation stays (36% vs. 24%).[refs] CareNavigator therefore targets an upstream, measurable intermediate outcome, whether a recognized need successfully reaches established care, before unmet needs force higher and costlier levels of care.</w:t>
+        <w:t xml:space="preserve"> Older Americans and their families face a problem the market has not solved. Unmet daily care needs compound into preventable geriatric hospitalization, premature institutionalization, and rising public costs, and each makes the next more likely (Figure 1). Olera developed CareNavigator through NIA Phase I–IIB as a care-navigation platform that helps families identify the care they need, the aid that can help pay for it, and the providers who can deliver it. Its impact potential comes from intervening while unmet need may still be reversible: among community-dwelling Medicaid HCBS users, unmet service needs have been associated with substantially greater emergency-department use (52% vs. 34%) and hospital or rehabilitation stays (36% vs. 24%).</w:t>
+      </w:r>
+      <w:r>
+        <w:rPr>
+          <w:b w:val="0"/>
+          <w:i w:val="0"/>
+          <w:sz w:val="16"/>
+          <w:position w:val="7"/>
+        </w:rPr>
+        <w:t>1</w:t>
+      </w:r>
+      <w:r>
+        <w:rPr>
+          <w:b w:val="0"/>
+          <w:i w:val="0"/>
+        </w:rPr>
+        <w:t xml:space="preserve"> CareNavigator therefore targets an upstream, measurable intermediate outcome, whether a recognized need successfully reaches established care, before unmet needs force higher and costlier levels of care.</w:t>
       </w:r>
     </w:p>
     <w:p>
@@ -269,7 +285,39 @@
           <w:b w:val="0"/>
           <w:i w:val="0"/>
         </w:rPr>
-        <w:t xml:space="preserve"> CareNavigator is deployed nationally, draws 15,500+ visitors per month through organic search at near-zero acquisition cost, and has demonstrated usability and technology acceptance in peer-reviewed studies.[refs] Caregiver Staffing has also been tested in prior pilots, where providers hired workers sourced through Olera and demonstrated willingness to pay for the service.[cite] Family demand, CareNavigator usability, and basic provider demand for Caregiver Staffing are therefore substantially de-risked. Five remaining risks must now be retired in sequence:</w:t>
+        <w:t xml:space="preserve"> CareNavigator is deployed nationally, draws 15,500+ visitors per month through organic search at near-zero acquisition cost, and has demonstrated usability and technology acceptance in peer-reviewed studies.</w:t>
+      </w:r>
+      <w:r>
+        <w:rPr>
+          <w:b w:val="0"/>
+          <w:i w:val="0"/>
+          <w:sz w:val="16"/>
+          <w:position w:val="7"/>
+        </w:rPr>
+        <w:t>2,3</w:t>
+      </w:r>
+      <w:r>
+        <w:rPr>
+          <w:b w:val="0"/>
+          <w:i w:val="0"/>
+        </w:rPr>
+        <w:t xml:space="preserve"> Caregiver Staffing has also been tested in prior pilots, where providers hired workers sourced through Olera and demonstrated willingness to pay for the service.</w:t>
+      </w:r>
+      <w:r>
+        <w:rPr>
+          <w:b w:val="0"/>
+          <w:i w:val="0"/>
+          <w:sz w:val="16"/>
+          <w:position w:val="7"/>
+        </w:rPr>
+        <w:t>4</w:t>
+      </w:r>
+      <w:r>
+        <w:rPr>
+          <w:b w:val="0"/>
+          <w:i w:val="0"/>
+        </w:rPr>
+        <w:t xml:space="preserve"> Family demand, CareNavigator usability, and basic provider demand for Caregiver Staffing are therefore substantially de-risked. Five remaining risks must now be retired in sequence:</w:t>
       </w:r>
     </w:p>
     <w:p>
@@ -1310,7 +1358,7 @@
           <w:i w:val="0"/>
           <w:sz w:val="18"/>
         </w:rPr>
-        <w:t xml:space="preserve"> Current approaches address portions of the care-establishment pathway; the CRP integrates them into a closed-loop system oriented to confirmed care.</w:t>
+        <w:t xml:space="preserve"> Current approaches address portions of the pathway; the CRP integrates them into a closed-loop system oriented to confirmed care.</w:t>
       </w:r>
     </w:p>
     <w:p>
@@ -1330,7 +1378,7 @@
           <w:b w:val="0"/>
           <w:i w:val="0"/>
         </w:rPr>
-        <w:t xml:space="preserve"> The commercial opportunity is not another directory, referral marketplace, or staffing channel in isolation. It is an integrated infrastructure that carries a family across the care-establishment pathway and creates evidence about what happened at every step. AI-supported execution moves the product from recommending what a family should do toward completing and tracking the work required to establish care, and every executed case produces a structured longitudinal record of the family's needs, resources pursued, administrative barriers, local capacity, care establishment, and subsequent outcomes.</w:t>
+        <w:t xml:space="preserve"> The commercial opportunity is not another directory, referral marketplace, or staffing channel in isolation. It is an integrated infrastructure that carries a family across the care-establishment pathway and creates evidence about what happened at every step. AI-supported execution moves the product from recommending what a family should do toward completing and tracking the work required to establish care, and every executed case produces a structured longitudinal record of the pathway.</w:t>
       </w:r>
     </w:p>
     <w:p>
@@ -2314,7 +2362,7 @@
           <w:b w:val="0"/>
           <w:i w:val="0"/>
         </w:rPr>
-        <w:t xml:space="preserve"> Olera's capabilities now extend beyond the founders and reflect several years of accumulated operating experience. The company combines software and applied AI engineering, an expert-curated eldercare data infrastructure, human-centered aging research, digital distribution, family/provider operations, and commercialization research. Five peer-reviewed studies established usability and technology acceptance, and direct family/provider operations continue to expose the team to the practical barriers between a recommendation and established care.</w:t>
+        <w:t xml:space="preserve"> Olera's capabilities now extend beyond the founders and reflect several years of accumulated operating experience. The company combines software and applied AI engineering, an expert-curated eldercare data infrastructure, human-centered aging research, digital distribution, family/provider operations, and commercialization research. Four peer-reviewed studies established usability and technology acceptance, and direct family/provider operations continue to expose the team to the practical barriers between a recommendation and established care.</w:t>
       </w:r>
     </w:p>
     <w:p>
@@ -2787,7 +2835,7 @@
           <w:b w:val="0"/>
           <w:i w:val="0"/>
         </w:rPr>
-        <w:t xml:space="preserve"> The United States employed approximately 4.68 million home health and personal care aides in 2024, with roughly 760,500 openings projected each year from 2024–2034; home-care benchmarking separately reported 75% median professional-caregiver turnover in 2024.</w:t>
+        <w:t xml:space="preserve"> The United States employed approximately 4.68 million home health and personal care aides in 2025, with roughly 760,500 openings projected each year from 2025 to 2035; home-care benchmarking separately reported 75% median professional-caregiver turnover in 2024.</w:t>
       </w:r>
       <w:r>
         <w:rPr>
@@ -2796,7 +2844,7 @@
           <w:sz w:val="16"/>
           <w:position w:val="7"/>
         </w:rPr>
-        <w:t>26,27</w:t>
+        <w:t>5,6</w:t>
       </w:r>
       <w:r>
         <w:rPr>
@@ -2812,7 +2860,7 @@
           <w:sz w:val="16"/>
           <w:position w:val="7"/>
         </w:rPr>
-        <w:t>28</w:t>
+        <w:t>7</w:t>
       </w:r>
       <w:r>
         <w:rPr>
@@ -2848,14 +2896,14 @@
           <w:sz w:val="16"/>
           <w:position w:val="7"/>
         </w:rPr>
-        <w:t>29,30</w:t>
+        <w:t>8,9</w:t>
       </w:r>
       <w:r>
         <w:rPr>
           <w:b w:val="0"/>
           <w:i w:val="0"/>
         </w:rPr>
-        <w:t xml:space="preserve"> CMS's active GUIDE Model further validates the purchasing logic: Medicare is already testing and paying for dementia care navigation, community-resource connection, and caregiver support with explicit goals of reducing hospitalization, delaying nursing-home placement, and reducing Medicare and Medicaid expenditures.</w:t>
+        <w:t xml:space="preserve"> CMS's active GUIDE Model further validates the purchasing logic: Medicare is already testing and paying for dementia care navigation, community-resource connection, and caregiver support, with the explicit aim of delaying nursing-home placement.</w:t>
       </w:r>
       <w:r>
         <w:rPr>
@@ -2864,7 +2912,7 @@
           <w:sz w:val="16"/>
           <w:position w:val="7"/>
         </w:rPr>
-        <w:t>31</w:t>
+        <w:t>10</w:t>
       </w:r>
     </w:p>
     <w:p>
@@ -3086,7 +3134,7 @@
           <w:sz w:val="16"/>
           <w:position w:val="7"/>
         </w:rPr>
-        <w:t>32,33</w:t>
+        <w:t>11,12</w:t>
       </w:r>
       <w:r>
         <w:rPr>
@@ -3122,7 +3170,7 @@
           <w:sz w:val="16"/>
           <w:position w:val="7"/>
         </w:rPr>
-        <w:t>34</w:t>
+        <w:t>13</w:t>
       </w:r>
       <w:r>
         <w:rPr>
@@ -3581,7 +3629,7 @@
           <w:b w:val="0"/>
           <w:i w:val="0"/>
         </w:rPr>
-        <w:t xml:space="preserve"> Olera will protect each component of its commercial advantage with the form of intellectual-property protection best suited to that asset. The principal proprietary assets generated and extended through the CRP include CareNavigator's non-public workflow orchestration and execution logic; the structure, normalization, quality-control methods, and derived variables that organize Olera's provider and financial-aid data; the longitudinal care-establishment and outcomes architecture and resulting proprietary datasets; and the methods that connect local workforce capacity to care execution. Olera will maintain appropriate non-public methods, configurations, derived data, and operating processes as trade secrets through role-based technical access, confidentiality obligations, and employee, contractor, and partner agreements governing confidentiality, intellectual-property ownership, and permitted data use. Original source code, interfaces, documentation, and content are protected by copyright, while Olera and product branding will be protected through trademark rights and registration where commercially appropriate. For CRP-generated inventions with sufficient novelty and commercial value, Olera will evaluate patent protection with IP counsel before public disclosure.</w:t>
+        <w:t xml:space="preserve"> Olera will protect each component of its commercial advantage with the form of intellectual-property protection best suited to that asset. The principal proprietary assets generated and extended through the CRP include CareNavigator's non-public workflow orchestration and execution logic; the structure, normalization, quality-control methods, and derived variables that organize Olera's provider and financial-aid data; the longitudinal care-establishment and outcomes architecture and resulting proprietary datasets; and the methods that connect local workforce capacity to care execution. Olera will maintain these as trade secrets through role-based technical access, confidentiality obligations, and employee, contractor, and partner agreements governing intellectual-property ownership and permitted data use. Original source code, interfaces, documentation, and content are protected by copyright, while Olera and product branding will be protected through trademark rights and registration where commercially appropriate. For CRP-generated inventions with sufficient novelty and commercial value, Olera will evaluate patent protection with IP counsel before public disclosure.</w:t>
       </w:r>
     </w:p>
     <w:p>
@@ -4490,7 +4538,7 @@
           <w:i w:val="0"/>
           <w:sz w:val="18"/>
         </w:rPr>
-        <w:t xml:space="preserve"> Olera uses distinct but coordinated acquisition channels to concentrate the participants and customers required for each local market.</w:t>
+        <w:t xml:space="preserve"> Distinct but coordinated acquisition channels concentrate the participants and customers each local market requires.</w:t>
       </w:r>
     </w:p>
     <w:tbl>
@@ -5124,7 +5172,7 @@
                 <w:sz w:val="18"/>
                 <w:position w:val="7"/>
               </w:rPr>
-              <w:t>1,3</w:t>
+              <w:t>6</w:t>
             </w:r>
           </w:p>
         </w:tc>
@@ -5220,7 +5268,7 @@
                 <w:sz w:val="18"/>
                 <w:position w:val="7"/>
               </w:rPr>
-              <w:t>2</w:t>
+              <w:t>14</w:t>
             </w:r>
           </w:p>
         </w:tc>
@@ -5549,7 +5597,7 @@
           <w:sz w:val="16"/>
           <w:position w:val="7"/>
         </w:rPr>
-        <w:t>7</w:t>
+        <w:t>5</w:t>
       </w:r>
     </w:p>
     <w:p>
@@ -5607,7 +5655,7 @@
           <w:sz w:val="16"/>
           <w:position w:val="7"/>
         </w:rPr>
-        <w:t>4-6</w:t>
+        <w:t>9,10</w:t>
       </w:r>
       <w:r>
         <w:rPr>
@@ -6642,7 +6690,7 @@
           <w:i w:val="0"/>
           <w:sz w:val="18"/>
         </w:rPr>
-        <w:t xml:space="preserve"> Illustrative base case through post-CRP Year 4, with the final column widening Year 5 into a Year 5 to Year 10 replication range. *Year 3 assumes approximately six paid-month equivalents across the eight CRP markets.</w:t>
+        <w:t xml:space="preserve"> Illustrative base case through post-CRP Year 4, with the final column widening Year 5 into a Year 5 to Year 10 range. *Six paid-month equivalents in Year 3.</w:t>
       </w:r>
     </w:p>
     <w:p>
@@ -7295,6 +7343,219 @@
         <w:t xml:space="preserve"> Five-year commercialization management timeline. Revenue values are planning projections rather than CRP success criteria.</w:t>
       </w:r>
     </w:p>
+    <w:p>
+      <w:pPr>
+        <w:keepNext/>
+        <w:pageBreakBefore/>
+        <w:spacing w:before="220" w:after="80"/>
+        <w:jc w:val="left"/>
+        <w:pBdr>
+          <w:bottom w:val="single" w:sz="12" w:space="2" w:color="000000"/>
+        </w:pBdr>
+      </w:pPr>
+      <w:r>
+        <w:rPr>
+          <w:b/>
+        </w:rPr>
+        <w:t>References</w:t>
+      </w:r>
+    </w:p>
+    <w:p>
+      <w:pPr>
+        <w:spacing w:after="80"/>
+        <w:ind w:left="317" w:hanging="317"/>
+        <w:jc w:val="left"/>
+      </w:pPr>
+      <w:r>
+        <w:rPr>
+          <w:b w:val="0"/>
+          <w:i w:val="0"/>
+        </w:rPr>
+        <w:t>1. Agency for Healthcare Research and Quality. Evidence Map on Home- and Community-Based Services and Person-Centered Care for Older Adults. Technical Brief No. 49; 2024.</w:t>
+      </w:r>
+    </w:p>
+    <w:p>
+      <w:pPr>
+        <w:spacing w:after="80"/>
+        <w:ind w:left="317" w:hanging="317"/>
+        <w:jc w:val="left"/>
+      </w:pPr>
+      <w:r>
+        <w:rPr>
+          <w:b w:val="0"/>
+          <w:i w:val="0"/>
+        </w:rPr>
+        <w:t>2. Fan Q, Hoang MN, DuBose L, et al. The Olera.care Digital Caregiving Assistance Platform for Dementia Caregivers: Preliminary Evaluation Study. JMIR Aging. 2024;7:e55132.</w:t>
+      </w:r>
+    </w:p>
+    <w:p>
+      <w:pPr>
+        <w:spacing w:after="80"/>
+        <w:ind w:left="317" w:hanging="317"/>
+        <w:jc w:val="left"/>
+      </w:pPr>
+      <w:r>
+        <w:rPr>
+          <w:b w:val="0"/>
+          <w:i w:val="0"/>
+        </w:rPr>
+        <w:t>3. Hoang MN, Kim L, Fisher L, et al. Exploring Informal Caregivers' Perception of the Olera Digital Caregiving Assistance Platform for Dementia Care. JMIR Form Res. 2026;10:e92967.</w:t>
+      </w:r>
+    </w:p>
+    <w:p>
+      <w:pPr>
+        <w:spacing w:after="80"/>
+        <w:ind w:left="317" w:hanging="317"/>
+        <w:jc w:val="left"/>
+      </w:pPr>
+      <w:r>
+        <w:rPr>
+          <w:b w:val="0"/>
+          <w:i w:val="0"/>
+        </w:rPr>
+        <w:t>4. Olera, Inc. Caregiver Staffing pilot placements and provider fees, 2024 to 2025. Data on file.</w:t>
+      </w:r>
+    </w:p>
+    <w:p>
+      <w:pPr>
+        <w:spacing w:after="80"/>
+        <w:ind w:left="317" w:hanging="317"/>
+        <w:jc w:val="left"/>
+      </w:pPr>
+      <w:r>
+        <w:rPr>
+          <w:b w:val="0"/>
+          <w:i w:val="0"/>
+        </w:rPr>
+        <w:t>5. U.S. Bureau of Labor Statistics. Home Health and Personal Care Aides. Occupational Outlook Handbook; 2025 to 2035 projections.</w:t>
+      </w:r>
+    </w:p>
+    <w:p>
+      <w:pPr>
+        <w:spacing w:after="80"/>
+        <w:ind w:left="317" w:hanging="317"/>
+        <w:jc w:val="left"/>
+      </w:pPr>
+      <w:r>
+        <w:rPr>
+          <w:b w:val="0"/>
+          <w:i w:val="0"/>
+        </w:rPr>
+        <w:t>6. Activated Insights. 2025 Benchmarking Report for Home-Based Care; 2025. Median caregiver turnover 75.0% in 2024.</w:t>
+      </w:r>
+    </w:p>
+    <w:p>
+      <w:pPr>
+        <w:spacing w:after="80"/>
+        <w:ind w:left="317" w:hanging="317"/>
+        <w:jc w:val="left"/>
+      </w:pPr>
+      <w:r>
+        <w:rPr>
+          <w:b w:val="0"/>
+          <w:i w:val="0"/>
+        </w:rPr>
+        <w:t>7. Activated Insights. 2024 Benchmarking Report for Home-Based Care; 2024. 63.3% of providers turned down cases in 2023.</w:t>
+      </w:r>
+    </w:p>
+    <w:p>
+      <w:pPr>
+        <w:spacing w:after="80"/>
+        <w:ind w:left="317" w:hanging="317"/>
+        <w:jc w:val="left"/>
+      </w:pPr>
+      <w:r>
+        <w:rPr>
+          <w:b w:val="0"/>
+          <w:i w:val="0"/>
+        </w:rPr>
+        <w:t>8. KFF. Medicare Advantage in 2026: Enrollment Update and Key Trends; 2026.</w:t>
+      </w:r>
+    </w:p>
+    <w:p>
+      <w:pPr>
+        <w:spacing w:after="80"/>
+        <w:ind w:left="317" w:hanging="317"/>
+        <w:jc w:val="left"/>
+      </w:pPr>
+      <w:r>
+        <w:rPr>
+          <w:b w:val="0"/>
+          <w:i w:val="0"/>
+        </w:rPr>
+        <w:t>9. Centers for Medicare and Medicaid Services. 2026 Medicare ACO Initiatives Participation Highlights; 2026.</w:t>
+      </w:r>
+    </w:p>
+    <w:p>
+      <w:pPr>
+        <w:spacing w:after="80"/>
+        <w:ind w:left="317" w:hanging="317"/>
+        <w:jc w:val="left"/>
+      </w:pPr>
+      <w:r>
+        <w:rPr>
+          <w:b w:val="0"/>
+          <w:i w:val="0"/>
+        </w:rPr>
+        <w:t>10. Centers for Medicare and Medicaid Services. Guiding an Improved Dementia Experience (GUIDE) Model; 2024.</w:t>
+      </w:r>
+    </w:p>
+    <w:p>
+      <w:pPr>
+        <w:spacing w:after="80"/>
+        <w:ind w:left="317" w:hanging="317"/>
+        <w:jc w:val="left"/>
+      </w:pPr>
+      <w:r>
+        <w:rPr>
+          <w:b w:val="0"/>
+          <w:i w:val="0"/>
+        </w:rPr>
+        <w:t>11. Association of American Medical Colleges. U.S. Medical Schools Enroll Record Number of Students in 2025; 2025.</w:t>
+      </w:r>
+    </w:p>
+    <w:p>
+      <w:pPr>
+        <w:spacing w:after="80"/>
+        <w:ind w:left="317" w:hanging="317"/>
+        <w:jc w:val="left"/>
+      </w:pPr>
+      <w:r>
+        <w:rPr>
+          <w:b w:val="0"/>
+          <w:i w:val="0"/>
+        </w:rPr>
+        <w:t>12. American Association of Colleges of Nursing. NursingCAS Application Cycle Closes with Most Applicants to Date; 2026.</w:t>
+      </w:r>
+    </w:p>
+    <w:p>
+      <w:pPr>
+        <w:spacing w:after="80"/>
+        <w:ind w:left="317" w:hanging="317"/>
+        <w:jc w:val="left"/>
+      </w:pPr>
+      <w:r>
+        <w:rPr>
+          <w:b w:val="0"/>
+          <w:i w:val="0"/>
+        </w:rPr>
+        <w:t>13. Augusta and Home Care Association of America. National Caregiver Recruitment Benchmark Report, Q1 2026; 2026.</w:t>
+      </w:r>
+    </w:p>
+    <w:p>
+      <w:pPr>
+        <w:spacing w:after="80"/>
+        <w:ind w:left="317" w:hanging="317"/>
+        <w:jc w:val="left"/>
+      </w:pPr>
+      <w:r>
+        <w:rPr>
+          <w:b w:val="0"/>
+          <w:i w:val="0"/>
+        </w:rPr>
+        <w:t>14. Activated Insights. Caregiver Retention for Home-Based Care; recruiting and training cost up to approximately $2,700 per replacement.</w:t>
+      </w:r>
+    </w:p>
     <w:sectPr>
       <w:pgSz w:w="12240" w:h="15840"/>
       <w:pgMar w:top="720" w:right="720" w:bottom="720" w:left="720" w:header="720" w:footer="720" w:gutter="0"/>

</xml_diff>

<commit_message>
Replace the Commercialization Plan opening paragraph
Use Logan's revision of the first paragraph of the Statement of Need.
It leads with the widening gap between need and available care, names
the vicious cycle explicitly before pointing at Figure 1, and closes on
the central measurable outcome rather than the cost-escalation framing.

The AHRQ unmet-need percentages carry reference 1 as before.
Pagination is unchanged: twelve pages of plan, references on page 13.

Co-Authored-By: Claude Opus 5 <noreply@anthropic.com>
Claude-Session: https://claude.ai/code/session_01HAZLkLE85rjRAgcZW1sudJ
</commit_message>
<xml_diff>
--- a/docs/crp/passes/Olera_CRP_CommercializationPlan_rebased.docx
+++ b/docs/crp/passes/Olera_CRP_CommercializationPlan_rebased.docx
@@ -131,7 +131,7 @@
           <w:b w:val="0"/>
           <w:i w:val="0"/>
         </w:rPr>
-        <w:t xml:space="preserve"> Older Americans and their families face a problem the market has not solved. Unmet daily care needs compound into preventable geriatric hospitalization, premature institutionalization, and rising public costs, and each makes the next more likely (Figure 1). Olera developed CareNavigator through NIA Phase I–IIB as a care-navigation platform that helps families identify the care they need, the aid that can help pay for it, and the providers who can deliver it. Its impact potential comes from intervening while unmet need may still be reversible: among community-dwelling Medicaid HCBS users, unmet service needs have been associated with substantially greater emergency-department use (52% vs. 34%) and hospital or rehabilitation stays (36% vs. 24%).</w:t>
+        <w:t xml:space="preserve"> The gap between older Americans who need help and the care available to them is growing. An aging population is increasing demand while families continue to face a fragmented system for finding providers, securing financial assistance, and establishing care. When care is not established, the consequences can compound into a vicious cycle of unmet need, hospitalization, failed care establishment, and premature institutionalization (Figure 1). Among community-dwelling Medicaid HCBS users, unmet service needs have been associated with substantially greater emergency-department use (52% vs. 34%) and hospital or rehabilitation stays (36% vs. 24%).</w:t>
       </w:r>
       <w:r>
         <w:rPr>
@@ -147,7 +147,7 @@
           <w:b w:val="0"/>
           <w:i w:val="0"/>
         </w:rPr>
-        <w:t xml:space="preserve"> CareNavigator therefore targets an upstream, measurable intermediate outcome, whether a recognized need successfully reaches established care, before unmet needs force higher and costlier levels of care.</w:t>
+        <w:t xml:space="preserve"> Olera developed CareNavigator through NIA Phase I–IIB to intervene earlier in this cycle by helping families identify appropriate care, find aid to pay for it, and connect with providers who can deliver it. Its central outcome is simple and measurable: does a recognized need reach established care?</w:t>
       </w:r>
     </w:p>
     <w:p>

</xml_diff>